<commit_message>
feat: restore CV details by trimming page margins
</commit_message>
<xml_diff>
--- a/public/cv/english/CV.docx
+++ b/public/cv/english/CV.docx
@@ -119,7 +119,7 @@
       </w:tblGrid>
       <w:tr>
         <w:trPr>
-          <w:trHeight w:val="2600"/>
+          <w:trHeight w:val="3000"/>
         </w:trPr>
         <w:tc>
           <w:tcPr>
@@ -266,7 +266,7 @@
               <w:rPr/>
             </w:pPr>
             <w:r>
-              <w:t>Final-year Computer Engineering student at Pamukkale University. I build backend-heavy web apps with NestJS, PostgreSQL and React, and have interned at ADM, FLAP Yazılım and TNC Group.</w:t>
+              <w:t>Final-year Computer Engineering student at Pamukkale University. I build backend-heavy web apps with NestJS, PostgreSQL and React. I have interned at ADM, FLAP Yazılım and TNC Group, and studied at the University of Maribor on Erasmus.</w:t>
             </w:r>
           </w:p>
         </w:tc>
@@ -1485,7 +1485,7 @@
               <w:pStyle w:val="767"/>
             </w:pPr>
             <w:r>
-              <w:t>Customer request case study: scope, requirements, React prototype.</w:t>
+              <w:t>Completed customer request case study: scope, requirements, wireframes, React prototype.</w:t>
             </w:r>
           </w:p>
           <w:p>
@@ -1630,7 +1630,7 @@
       <w:endnotePr/>
       <w:type w:val="nextPage"/>
       <w:pgSz w:h="15840" w:orient="portrait" w:w="12240"/>
-      <w:pgMar w:top="560" w:right="720" w:bottom="240" w:left="720" w:header="0" w:footer="0" w:gutter="0"/>
+      <w:pgMar w:top="200" w:right="720" w:bottom="100" w:left="720" w:header="0" w:footer="0" w:gutter="0"/>
       <w:cols w:num="1" w:sep="0" w:space="720" w:equalWidth="1"/>
     </w:sectPr>
   </w:body>

</xml_diff>

<commit_message>
feat: readable skills block in CV
</commit_message>
<xml_diff>
--- a/public/cv/english/CV.docx
+++ b/public/cv/english/CV.docx
@@ -612,36 +612,63 @@
             <w:pPr>
               <w:pStyle w:val="767"/>
               <w:pBdr/>
-              <w:spacing/>
+              <w:spacing w:after="180"/>
+              <w:contextualSpacing w:val="0"/>
               <w:ind/>
               <w:rPr/>
             </w:pPr>
+            <w:r/>
             <w:r>
-              <w:t>Programming Languages: Java, C#, TypeScript, SQL, HTML, CSS</w:t>
+              <w:rPr>
+                <w:b/>
+              </w:rPr>
+              <w:t>Programming Languages</w:t>
+              <w:br/>
+            </w:r>
+            <w:r>
+              <w:t>Java, C#, TypeScript, SQL, HTML, CSS</w:t>
             </w:r>
           </w:p>
           <w:p>
             <w:pPr>
               <w:pStyle w:val="767"/>
               <w:pBdr/>
-              <w:spacing/>
+              <w:spacing w:after="180"/>
+              <w:contextualSpacing w:val="0"/>
               <w:ind/>
               <w:rPr/>
             </w:pPr>
+            <w:r/>
             <w:r>
-              <w:t>Frameworks &amp; Technologies: React, Next.js, React Native, Flutter, NestJS, REST API, .NET, .NET Web API, MS SQL Server, PostgreSQL, Expo</w:t>
+              <w:rPr>
+                <w:b/>
+              </w:rPr>
+              <w:t>Frameworks &amp; Technologies</w:t>
+              <w:br/>
+            </w:r>
+            <w:r>
+              <w:t>React, Next.js, React Native, Flutter, NestJS, REST API, .NET, .NET Web API, MS SQL Server, PostgreSQL, Expo</w:t>
             </w:r>
           </w:p>
           <w:p>
             <w:pPr>
               <w:pStyle w:val="767"/>
               <w:pBdr/>
-              <w:spacing/>
+              <w:spacing w:after="180"/>
+              <w:contextualSpacing w:val="0"/>
               <w:ind/>
               <w:rPr/>
             </w:pPr>
+            <w:r/>
             <w:r>
-              <w:t>Tools &amp; Software: Git/GitHub, Docker, Linux</w:t>
+              <w:rPr>
+                <w:b/>
+              </w:rPr>
+              <w:t>Tools &amp; Software</w:t>
+              <w:br/>
+            </w:r>
+            <w:r>
+              <w:t>Git/GitHub, Docker, Linux</w:t>
             </w:r>
           </w:p>
         </w:tc>

</xml_diff>

<commit_message>
feat: group CV skills into sub-bullets
</commit_message>
<xml_diff>
--- a/public/cv/english/CV.docx
+++ b/public/cv/english/CV.docx
@@ -610,10 +610,8 @@
           </w:p>
           <w:p>
             <w:pPr>
-              <w:pStyle w:val="767"/>
               <w:pBdr/>
-              <w:spacing w:after="180"/>
-              <w:contextualSpacing w:val="0"/>
+              <w:spacing w:before="120"/>
               <w:ind/>
               <w:rPr/>
             </w:pPr>
@@ -623,18 +621,28 @@
                 <w:b/>
               </w:rPr>
               <w:t>Programming Languages</w:t>
-              <w:br/>
-            </w:r>
-            <w:r>
-              <w:t>Java, C#, TypeScript, SQL, HTML, CSS</w:t>
             </w:r>
           </w:p>
           <w:p>
             <w:pPr>
               <w:pStyle w:val="767"/>
+            </w:pPr>
+            <w:r>
+              <w:t>Java, C#, TypeScript</w:t>
+            </w:r>
+          </w:p>
+          <w:p>
+            <w:pPr>
+              <w:pStyle w:val="767"/>
+            </w:pPr>
+            <w:r>
+              <w:t>SQL, HTML, CSS</w:t>
+            </w:r>
+          </w:p>
+          <w:p>
+            <w:pPr>
               <w:pBdr/>
-              <w:spacing w:after="180"/>
-              <w:contextualSpacing w:val="0"/>
+              <w:spacing w:before="120"/>
               <w:ind/>
               <w:rPr/>
             </w:pPr>
@@ -644,18 +652,44 @@
                 <w:b/>
               </w:rPr>
               <w:t>Frameworks &amp; Technologies</w:t>
-              <w:br/>
-            </w:r>
-            <w:r>
-              <w:t>React, Next.js, React Native, Flutter, NestJS, REST API, .NET, .NET Web API, MS SQL Server, PostgreSQL, Expo</w:t>
             </w:r>
           </w:p>
           <w:p>
             <w:pPr>
               <w:pStyle w:val="767"/>
+            </w:pPr>
+            <w:r>
+              <w:t>Frontend: React, Next.js</w:t>
+            </w:r>
+          </w:p>
+          <w:p>
+            <w:pPr>
+              <w:pStyle w:val="767"/>
+            </w:pPr>
+            <w:r>
+              <w:t>Mobile: React Native, Flutter, Expo</w:t>
+            </w:r>
+          </w:p>
+          <w:p>
+            <w:pPr>
+              <w:pStyle w:val="767"/>
+            </w:pPr>
+            <w:r>
+              <w:t>Backend: NestJS, .NET, .NET Web API, REST API</w:t>
+            </w:r>
+          </w:p>
+          <w:p>
+            <w:pPr>
+              <w:pStyle w:val="767"/>
+            </w:pPr>
+            <w:r>
+              <w:t>Databases: PostgreSQL, MS SQL Server</w:t>
+            </w:r>
+          </w:p>
+          <w:p>
+            <w:pPr>
               <w:pBdr/>
-              <w:spacing w:after="180"/>
-              <w:contextualSpacing w:val="0"/>
+              <w:spacing w:before="120"/>
               <w:ind/>
               <w:rPr/>
             </w:pPr>
@@ -665,8 +699,12 @@
                 <w:b/>
               </w:rPr>
               <w:t>Tools &amp; Software</w:t>
-              <w:br/>
             </w:r>
+          </w:p>
+          <w:p>
+            <w:pPr>
+              <w:pStyle w:val="767"/>
+            </w:pPr>
             <w:r>
               <w:t>Git/GitHub, Docker, Linux</w:t>
             </w:r>

</xml_diff>

<commit_message>
fix: extend CV sidebar to page bottom, switch to light blue
</commit_message>
<xml_diff>
--- a/public/cv/english/CV.docx
+++ b/public/cv/english/CV.docx
@@ -23,8 +23,8 @@
                 <wp:positionH relativeFrom="page">
                   <wp:posOffset>0</wp:posOffset>
                 </wp:positionH>
-                <wp:positionV relativeFrom="paragraph">
-                  <wp:posOffset>-402590</wp:posOffset>
+                <wp:positionV relativeFrom="page">
+                  <wp:posOffset>0</wp:posOffset>
                 </wp:positionV>
                 <wp:extent cx="2816352" cy="10058400"/>
                 <wp:effectExtent l="0" t="0" r="3175" b="0"/>
@@ -45,7 +45,7 @@
                           <a:avLst/>
                         </a:prstGeom>
                         <a:solidFill>
-                          <a:schemeClr val="accent1"/>
+                          <a:srgbClr val="DCE6F2"/>
                         </a:solidFill>
                         <a:ln>
                           <a:noFill/>

</xml_diff>